<commit_message>
Name the Spica backend on Ludwig across the CV and LinkedIn
Both documents listed only frontend technology for the flagship project,
which reads as a frontend developer under a Lead Full Stack headline.
Saif builds Ludwig's backend on Spica - the buckets and the server-side
functions - so that now says so in the CV, the LinkedIn project and the
TMN role.

Co-Authored-By: Claude Opus 5 <noreply@anthropic.com>
Claude-Session: https://claude.ai/code/session_01QHYshPgJzJ5DDfZnK4J8sf
</commit_message>
<xml_diff>
--- a/profile/cv/generated/Saif_ur_Rehman_CV.docx
+++ b/profile/cv/generated/Saif_ur_Rehman_CV.docx
@@ -315,7 +315,7 @@
         <w:rPr>
           <w:sz w:val="21"/>
         </w:rPr>
-        <w:t>•  Built Ludwig largely from scratch, owning product architecture, UI design, frontend development, backend integration, testing, deployment, and ongoing improvements.</w:t>
+        <w:t>•  Built Ludwig largely from scratch, owning product architecture, UI design, frontend development, backend on Spica, testing, deployment, and ongoing improvements.</w:t>
       </w:r>
     </w:p>
     <w:p>
@@ -407,7 +407,7 @@
           <w:color w:val="444444"/>
           <w:sz w:val="19"/>
         </w:rPr>
-        <w:t>Stack: Angular 19, Ionic 8, TypeScript, Next.js 16, React 19, Flutter, RxJS, NgRx Signals, Tailwind CSS, Playwright, PDF workflows</w:t>
+        <w:t>Stack: Angular 19, Ionic 8, TypeScript, Next.js 16, React 19, Flutter, RxJS, NgRx Signals, Tailwind CSS, Playwright, Spica (buckets and functions), PDF workflows</w:t>
       </w:r>
     </w:p>
     <w:p>
@@ -570,7 +570,7 @@
           <w:color w:val="444444"/>
           <w:sz w:val="19"/>
         </w:rPr>
-        <w:t>Angular, Ionic, TypeScript, Next.js, React, Flutter, RxJS, Tailwind CSS, Playwright, PDF generation</w:t>
+        <w:t>Angular, Ionic, TypeScript, Next.js, React, Flutter, RxJS, Tailwind CSS, Playwright, PDF generation, Spica</w:t>
       </w:r>
     </w:p>
     <w:p>
@@ -596,7 +596,7 @@
         <w:rPr>
           <w:sz w:val="21"/>
         </w:rPr>
-        <w:t>•  Built web and mobile interfaces with Angular, Ionic, React, Next.js, and Flutter, including offline-first synchronization, multi-tenancy, PDF workflows, and Playwright testing.</w:t>
+        <w:t>•  Built web and mobile interfaces with Angular, Ionic, React, Next.js, and Flutter, including offline-first synchronization, multi-tenancy, PDF workflows, Playwright testing, and a Spica backend of buckets and functions.</w:t>
       </w:r>
     </w:p>
     <w:p>

</xml_diff>

<commit_message>
Correct the Atomix stack on the CV to match his own skill tags
The CV claimed React and NestJS, which he says he never used there, plus
Redis and Stripe, which appear in none of the fourteen skills he tagged
on the project. It now reads Angular, PrimeNG, TypeScript, Node.js,
Express.js, Sequelize, MariaDB, Firebase and AWS S3 - identical to the
LinkedIn technologies line.

Co-Authored-By: Claude Opus 5 <noreply@anthropic.com>
Claude-Session: https://claude.ai/code/session_01QHYshPgJzJ5DDfZnK4J8sf
</commit_message>
<xml_diff>
--- a/profile/cv/generated/Saif_ur_Rehman_CV.docx
+++ b/profile/cv/generated/Saif_ur_Rehman_CV.docx
@@ -623,7 +623,7 @@
           <w:color w:val="444444"/>
           <w:sz w:val="19"/>
         </w:rPr>
-        <w:t>atomixlogistics.com  |  React, Angular, NestJS, Node.js, MariaDB, Redis, Stripe, AWS</w:t>
+        <w:t>atomixlogistics.com  |  Angular, PrimeNG, TypeScript, Node.js, Express.js, Sequelize, MariaDB, Firebase, AWS S3</w:t>
       </w:r>
     </w:p>
     <w:p>
@@ -649,7 +649,7 @@
         <w:rPr>
           <w:sz w:val="21"/>
         </w:rPr>
-        <w:t>•  Implemented real-time order updates and operational dashboards using React, Angular, NestJS, Node.js, MariaDB, and Redis; integrated Stripe and AWS infrastructure.</w:t>
+        <w:t>•  Implemented real-time order updates and operational dashboards using Angular, PrimeNG, TypeScript, Node.js, Express.js, Sequelize, MariaDB, Firebase, and AWS S3.</w:t>
       </w:r>
     </w:p>
     <w:p>

</xml_diff>

<commit_message>
Correct EquipX on both documents: React not Angular, no GraphQL
He confirmed React rather than Angular, Stripe and Socket.IO both real,
and no GraphQL on this project - so the GraphQL paragraph that had been
the centre of the LinkedIn entry is gone, and the CV's Angular and Docker
claims go with it.

Co-Authored-By: Claude Opus 5 <noreply@anthropic.com>
Claude-Session: https://claude.ai/code/session_01QHYshPgJzJ5DDfZnK4J8sf
</commit_message>
<xml_diff>
--- a/profile/cv/generated/Saif_ur_Rehman_CV.docx
+++ b/profile/cv/generated/Saif_ur_Rehman_CV.docx
@@ -676,7 +676,7 @@
           <w:color w:val="444444"/>
           <w:sz w:val="19"/>
         </w:rPr>
-        <w:t>equipx.com  |  Angular, Next.js, Node.js, MongoDB, Socket.IO, Stripe, AWS, Docker</w:t>
+        <w:t>equipx.com  |  React, Next.js, Node.js, Express.js, MongoDB, Socket.IO, Cloudinary, Stripe, AWS</w:t>
       </w:r>
     </w:p>
     <w:p>
@@ -702,7 +702,7 @@
         <w:rPr>
           <w:sz w:val="21"/>
         </w:rPr>
-        <w:t>•  Built real-time chat and communication features using Angular, Next.js, Node.js, and Socket.IO, with Stripe, MongoDB, AWS, and Docker integrations.</w:t>
+        <w:t>•  Built real-time chat and communication features using React, Next.js, Node.js, Express.js, and Socket.IO, with Stripe, MongoDB, Cloudinary, and AWS integrations.</w:t>
       </w:r>
     </w:p>
     <w:p>

</xml_diff>

<commit_message>
Add the missing technologies to the CV skills section
GraphQL, Spica, Cloudinary, Jest, ESLint, SonarQube, GitLab, Bitbucket
and Google Maps APIs all appeared in a role or project line, or in the
LinkedIn About, but in neither skills list. GraphQL mattered most - the
skills block is what an ATS parses.

The three lines overflow the text width once extended, and each block in
the PDF is absolutely positioned, so inserting a wrapped line would have
collided with the next section. Rebuilt through the layout engine
instead; the only diff against the previous file is these additions.

Co-Authored-By: Claude Opus 5 <noreply@anthropic.com>
Claude-Session: https://claude.ai/code/session_01QHYshPgJzJ5DDfZnK4J8sf
</commit_message>
<xml_diff>
--- a/profile/cv/generated/Saif_ur_Rehman_CV.docx
+++ b/profile/cv/generated/Saif_ur_Rehman_CV.docx
@@ -169,7 +169,7 @@
         <w:rPr>
           <w:sz w:val="21"/>
         </w:rPr>
-        <w:t>Node.js, NestJS, Express.js, FastAPI, REST APIs, WebSockets, Socket.IO, Firebase Functions, Microservices</w:t>
+        <w:t>Node.js, NestJS, Express.js, FastAPI, REST APIs, GraphQL, WebSockets, Socket.IO, Firebase Functions, Microservices, Spica</w:t>
       </w:r>
     </w:p>
     <w:p>
@@ -207,7 +207,7 @@
         <w:rPr>
           <w:sz w:val="21"/>
         </w:rPr>
-        <w:t>AWS EC2, AWS S3, AWS Lambda, AWS SNS, Docker, Nginx, GitHub Actions, CI/CD, Vercel</w:t>
+        <w:t>AWS EC2, AWS S3, AWS Lambda, AWS SNS, Docker, Nginx, GitHub Actions, CI/CD, Vercel, Git, GitHub, GitLab, Bitbucket</w:t>
       </w:r>
     </w:p>
     <w:p>
@@ -245,7 +245,7 @@
         <w:rPr>
           <w:sz w:val="21"/>
         </w:rPr>
-        <w:t>Stripe, Twilio, Firebase Cloud Messaging, OAuth, third-party APIs, Playwright, Git, GitHub</w:t>
+        <w:t>Stripe, Twilio, Cloudinary, Firebase Cloud Messaging, OAuth, Google Maps APIs, third-party APIs, Jest, Playwright, ESLint, SonarQube</w:t>
       </w:r>
     </w:p>
     <w:p>
@@ -380,7 +380,7 @@
         <w:rPr>
           <w:sz w:val="21"/>
         </w:rPr>
-        <w:t>•  Guide a team of 3-4 engineers across additional products through technical direction, code reviews, implementation support, and delivery guidance.</w:t>
+        <w:t>•  Guide a team of 3–4 engineers across additional products through technical direction, code reviews, implementation support, and delivery guidance.</w:t>
       </w:r>
     </w:p>
     <w:p>
@@ -447,7 +447,7 @@
         <w:rPr>
           <w:sz w:val="21"/>
         </w:rPr>
-        <w:t>•  Led a team of 5-10 developers delivering full stack web and mobile applications for logistics, marketplaces, real estate, and field-service businesses.</w:t>
+        <w:t>•  Led a team of 5–10 developers delivering full stack web and mobile applications for logistics, marketplaces, real estate, and field-service businesses.</w:t>
       </w:r>
     </w:p>
     <w:p>
@@ -556,7 +556,7 @@
           <w:i w:val="0"/>
           <w:sz w:val="21"/>
         </w:rPr>
-        <w:t>Ludwig Practice Suite - Healthcare Practice Management and Patient Booking Platform</w:t>
+        <w:t>Ludwig Practice Suite — Healthcare Practice Management and Patient Booking Platform</w:t>
       </w:r>
     </w:p>
     <w:p>
@@ -609,7 +609,7 @@
           <w:i w:val="0"/>
           <w:sz w:val="21"/>
         </w:rPr>
-        <w:t>Atomix Logistics - 3PL Logistics and Order Fulfilment Platform</w:t>
+        <w:t>Atomix Logistics — 3PL Logistics and Order Fulfilment Platform</w:t>
       </w:r>
     </w:p>
     <w:p>
@@ -662,7 +662,7 @@
           <w:i w:val="0"/>
           <w:sz w:val="21"/>
         </w:rPr>
-        <w:t>EquipX - Heavy Equipment Marketplace</w:t>
+        <w:t>EquipX — Heavy Equipment Marketplace</w:t>
       </w:r>
     </w:p>
     <w:p>

</xml_diff>

<commit_message>
CV: put the TMN bullets in consistent present tense
The role is current but the bullets alternated between present and past,
with Developed and Develop both appearing. All eight now read in present
tense. Same facts, no other wording changes.

Co-Authored-By: Claude Opus 5 <noreply@anthropic.com>
Claude-Session: https://claude.ai/code/session_01QHYshPgJzJ5DDfZnK4J8sf
</commit_message>
<xml_diff>
--- a/profile/cv/generated/Saif_ur_Rehman_CV.docx
+++ b/profile/cv/generated/Saif_ur_Rehman_CV.docx
@@ -315,7 +315,7 @@
         <w:rPr>
           <w:sz w:val="21"/>
         </w:rPr>
-        <w:t>•  Built Ludwig largely from scratch, owning product architecture, UI design, frontend development, backend on Spica, testing, deployment, and ongoing improvements.</w:t>
+        <w:t>•  Own Ludwig end to end — product architecture, UI design, frontend development, backend on Spica, testing, deployment, and ongoing improvements, built largely from scratch.</w:t>
       </w:r>
     </w:p>
     <w:p>
@@ -341,7 +341,7 @@
         <w:rPr>
           <w:sz w:val="21"/>
         </w:rPr>
-        <w:t>•  Developed clinical documentation, patient management, appointment scheduling, recurring bookings, resource management, therapist absences, waiting lists, available time slots, and statutory health insurance invoicing.</w:t>
+        <w:t>•  Deliver clinical documentation, patient management, appointment scheduling, recurring bookings, resource management, therapist absences, waiting lists, available time slots, and statutory health insurance invoicing.</w:t>
       </w:r>
     </w:p>
     <w:p>
@@ -354,7 +354,7 @@
         <w:rPr>
           <w:sz w:val="21"/>
         </w:rPr>
-        <w:t>•  Implemented multi-tenant architecture and offline-first synchronization with conflict handling to support reliable usage across practices and environments.</w:t>
+        <w:t>•  Implement multi-tenant architecture and offline-first synchronization with conflict handling to support reliable usage across practices and environments.</w:t>
       </w:r>
     </w:p>
     <w:p>
@@ -367,7 +367,7 @@
         <w:rPr>
           <w:sz w:val="21"/>
         </w:rPr>
-        <w:t>•  Develop responsive web and mobile experiences using Angular, Ionic, TypeScript, Next.js, React, and Flutter.</w:t>
+        <w:t>•  Build responsive web and mobile experiences using Angular, Ionic, TypeScript, Next.js, React, and Flutter.</w:t>
       </w:r>
     </w:p>
     <w:p>
@@ -393,7 +393,7 @@
         <w:rPr>
           <w:sz w:val="21"/>
         </w:rPr>
-        <w:t>•  Contributed to additional products including a business connector, business-card management platform, and regional public registry platform for recently deceased persons.</w:t>
+        <w:t>•  Contribute to additional products including a business connector, business-card management platform, and regional public registry platform for recently deceased persons.</w:t>
       </w:r>
     </w:p>
     <w:p>

</xml_diff>